<commit_message>
updateed on sept 26 2026
</commit_message>
<xml_diff>
--- a/Pushing code to Git hub_Notes.docx
+++ b/Pushing code to Git hub_Notes.docx
@@ -225,7 +225,986 @@
         </w:drawing>
       </w:r>
     </w:p>
+    <w:p>
+      <w:r>
+        <w:rPr>
+          <w:noProof/>
+        </w:rPr>
+        <w:drawing>
+          <wp:inline distT="0" distB="0" distL="0" distR="0" wp14:anchorId="25FF8EE5" wp14:editId="37FDEE13">
+            <wp:extent cx="5937250" cy="2492375"/>
+            <wp:effectExtent l="0" t="0" r="6350" b="3175"/>
+            <wp:docPr id="1328673206" name="Picture 7"/>
+            <wp:cNvGraphicFramePr>
+              <a:graphicFrameLocks xmlns:a="http://schemas.openxmlformats.org/drawingml/2006/main" noChangeAspect="1"/>
+            </wp:cNvGraphicFramePr>
+            <a:graphic xmlns:a="http://schemas.openxmlformats.org/drawingml/2006/main">
+              <a:graphicData uri="http://schemas.openxmlformats.org/drawingml/2006/picture">
+                <pic:pic xmlns:pic="http://schemas.openxmlformats.org/drawingml/2006/picture">
+                  <pic:nvPicPr>
+                    <pic:cNvPr id="0" name="Picture 7"/>
+                    <pic:cNvPicPr>
+                      <a:picLocks noChangeAspect="1" noChangeArrowheads="1"/>
+                    </pic:cNvPicPr>
+                  </pic:nvPicPr>
+                  <pic:blipFill>
+                    <a:blip r:embed="rId8">
+                      <a:extLst>
+                        <a:ext uri="{28A0092B-C50C-407E-A947-70E740481C1C}">
+                          <a14:useLocalDpi xmlns:a14="http://schemas.microsoft.com/office/drawing/2010/main" val="0"/>
+                        </a:ext>
+                      </a:extLst>
+                    </a:blip>
+                    <a:srcRect/>
+                    <a:stretch>
+                      <a:fillRect/>
+                    </a:stretch>
+                  </pic:blipFill>
+                  <pic:spPr bwMode="auto">
+                    <a:xfrm>
+                      <a:off x="0" y="0"/>
+                      <a:ext cx="5937250" cy="2492375"/>
+                    </a:xfrm>
+                    <a:prstGeom prst="rect">
+                      <a:avLst/>
+                    </a:prstGeom>
+                    <a:noFill/>
+                    <a:ln>
+                      <a:noFill/>
+                    </a:ln>
+                  </pic:spPr>
+                </pic:pic>
+              </a:graphicData>
+            </a:graphic>
+          </wp:inline>
+        </w:drawing>
+      </w:r>
+    </w:p>
+    <w:p>
+      <w:r>
+        <w:rPr>
+          <w:noProof/>
+        </w:rPr>
+        <w:drawing>
+          <wp:inline distT="0" distB="0" distL="0" distR="0" wp14:anchorId="6236757B" wp14:editId="56D6D571">
+            <wp:extent cx="5941695" cy="4588510"/>
+            <wp:effectExtent l="0" t="0" r="1905" b="2540"/>
+            <wp:docPr id="1842117532" name="Picture 9"/>
+            <wp:cNvGraphicFramePr>
+              <a:graphicFrameLocks xmlns:a="http://schemas.openxmlformats.org/drawingml/2006/main" noChangeAspect="1"/>
+            </wp:cNvGraphicFramePr>
+            <a:graphic xmlns:a="http://schemas.openxmlformats.org/drawingml/2006/main">
+              <a:graphicData uri="http://schemas.openxmlformats.org/drawingml/2006/picture">
+                <pic:pic xmlns:pic="http://schemas.openxmlformats.org/drawingml/2006/picture">
+                  <pic:nvPicPr>
+                    <pic:cNvPr id="0" name="Picture 9"/>
+                    <pic:cNvPicPr>
+                      <a:picLocks noChangeAspect="1" noChangeArrowheads="1"/>
+                    </pic:cNvPicPr>
+                  </pic:nvPicPr>
+                  <pic:blipFill>
+                    <a:blip r:embed="rId9">
+                      <a:extLst>
+                        <a:ext uri="{28A0092B-C50C-407E-A947-70E740481C1C}">
+                          <a14:useLocalDpi xmlns:a14="http://schemas.microsoft.com/office/drawing/2010/main" val="0"/>
+                        </a:ext>
+                      </a:extLst>
+                    </a:blip>
+                    <a:srcRect/>
+                    <a:stretch>
+                      <a:fillRect/>
+                    </a:stretch>
+                  </pic:blipFill>
+                  <pic:spPr bwMode="auto">
+                    <a:xfrm>
+                      <a:off x="0" y="0"/>
+                      <a:ext cx="5941695" cy="4588510"/>
+                    </a:xfrm>
+                    <a:prstGeom prst="rect">
+                      <a:avLst/>
+                    </a:prstGeom>
+                    <a:noFill/>
+                    <a:ln>
+                      <a:noFill/>
+                    </a:ln>
+                  </pic:spPr>
+                </pic:pic>
+              </a:graphicData>
+            </a:graphic>
+          </wp:inline>
+        </w:drawing>
+      </w:r>
+    </w:p>
     <w:p/>
+    <w:p>
+      <w:r>
+        <w:t xml:space="preserve">After &lt;git init&gt; command, .git folder (local git repository) has been created. But the code files are still in the working directory   </w:t>
+      </w:r>
+    </w:p>
+    <w:p>
+      <w:r>
+        <w:rPr>
+          <w:noProof/>
+        </w:rPr>
+        <w:drawing>
+          <wp:inline distT="0" distB="0" distL="0" distR="0" wp14:anchorId="3927B7F1" wp14:editId="0583CEB4">
+            <wp:extent cx="5937250" cy="3235960"/>
+            <wp:effectExtent l="0" t="0" r="6350" b="2540"/>
+            <wp:docPr id="1420551428" name="Picture 10"/>
+            <wp:cNvGraphicFramePr>
+              <a:graphicFrameLocks xmlns:a="http://schemas.openxmlformats.org/drawingml/2006/main" noChangeAspect="1"/>
+            </wp:cNvGraphicFramePr>
+            <a:graphic xmlns:a="http://schemas.openxmlformats.org/drawingml/2006/main">
+              <a:graphicData uri="http://schemas.openxmlformats.org/drawingml/2006/picture">
+                <pic:pic xmlns:pic="http://schemas.openxmlformats.org/drawingml/2006/picture">
+                  <pic:nvPicPr>
+                    <pic:cNvPr id="0" name="Picture 10"/>
+                    <pic:cNvPicPr>
+                      <a:picLocks noChangeAspect="1" noChangeArrowheads="1"/>
+                    </pic:cNvPicPr>
+                  </pic:nvPicPr>
+                  <pic:blipFill>
+                    <a:blip r:embed="rId10">
+                      <a:extLst>
+                        <a:ext uri="{28A0092B-C50C-407E-A947-70E740481C1C}">
+                          <a14:useLocalDpi xmlns:a14="http://schemas.microsoft.com/office/drawing/2010/main" val="0"/>
+                        </a:ext>
+                      </a:extLst>
+                    </a:blip>
+                    <a:srcRect/>
+                    <a:stretch>
+                      <a:fillRect/>
+                    </a:stretch>
+                  </pic:blipFill>
+                  <pic:spPr bwMode="auto">
+                    <a:xfrm>
+                      <a:off x="0" y="0"/>
+                      <a:ext cx="5937250" cy="3235960"/>
+                    </a:xfrm>
+                    <a:prstGeom prst="rect">
+                      <a:avLst/>
+                    </a:prstGeom>
+                    <a:noFill/>
+                    <a:ln>
+                      <a:noFill/>
+                    </a:ln>
+                  </pic:spPr>
+                </pic:pic>
+              </a:graphicData>
+            </a:graphic>
+          </wp:inline>
+        </w:drawing>
+      </w:r>
+    </w:p>
+    <w:p>
+      <w:r>
+        <w:rPr>
+          <w:noProof/>
+        </w:rPr>
+        <w:drawing>
+          <wp:inline distT="0" distB="0" distL="0" distR="0" wp14:anchorId="4B9B9A0B" wp14:editId="10EF6957">
+            <wp:extent cx="5943600" cy="3042920"/>
+            <wp:effectExtent l="0" t="0" r="0" b="5080"/>
+            <wp:docPr id="1525615202" name="Picture 11"/>
+            <wp:cNvGraphicFramePr>
+              <a:graphicFrameLocks xmlns:a="http://schemas.openxmlformats.org/drawingml/2006/main" noChangeAspect="1"/>
+            </wp:cNvGraphicFramePr>
+            <a:graphic xmlns:a="http://schemas.openxmlformats.org/drawingml/2006/main">
+              <a:graphicData uri="http://schemas.openxmlformats.org/drawingml/2006/picture">
+                <pic:pic xmlns:pic="http://schemas.openxmlformats.org/drawingml/2006/picture">
+                  <pic:nvPicPr>
+                    <pic:cNvPr id="0" name="Picture 11"/>
+                    <pic:cNvPicPr>
+                      <a:picLocks noChangeAspect="1" noChangeArrowheads="1"/>
+                    </pic:cNvPicPr>
+                  </pic:nvPicPr>
+                  <pic:blipFill>
+                    <a:blip r:embed="rId11">
+                      <a:extLst>
+                        <a:ext uri="{28A0092B-C50C-407E-A947-70E740481C1C}">
+                          <a14:useLocalDpi xmlns:a14="http://schemas.microsoft.com/office/drawing/2010/main" val="0"/>
+                        </a:ext>
+                      </a:extLst>
+                    </a:blip>
+                    <a:srcRect/>
+                    <a:stretch>
+                      <a:fillRect/>
+                    </a:stretch>
+                  </pic:blipFill>
+                  <pic:spPr bwMode="auto">
+                    <a:xfrm>
+                      <a:off x="0" y="0"/>
+                      <a:ext cx="5943600" cy="3042920"/>
+                    </a:xfrm>
+                    <a:prstGeom prst="rect">
+                      <a:avLst/>
+                    </a:prstGeom>
+                    <a:noFill/>
+                    <a:ln>
+                      <a:noFill/>
+                    </a:ln>
+                  </pic:spPr>
+                </pic:pic>
+              </a:graphicData>
+            </a:graphic>
+          </wp:inline>
+        </w:drawing>
+      </w:r>
+    </w:p>
+    <w:p/>
+    <w:p>
+      <w:r>
+        <w:t>Now we need to add the code files from working directory to local git repository</w:t>
+      </w:r>
+    </w:p>
+    <w:p>
+      <w:r>
+        <w:t>From working directory to staging area (temporary area)</w:t>
+      </w:r>
+    </w:p>
+    <w:p>
+      <w:r>
+        <w:t xml:space="preserve">  git add .  (it add all files to stagging area) </w:t>
+      </w:r>
+    </w:p>
+    <w:p>
+      <w:r>
+        <w:rPr>
+          <w:noProof/>
+        </w:rPr>
+        <w:drawing>
+          <wp:inline distT="0" distB="0" distL="0" distR="0" wp14:anchorId="3201B65C" wp14:editId="58B33FB0">
+            <wp:extent cx="5941695" cy="6300470"/>
+            <wp:effectExtent l="0" t="0" r="1905" b="5080"/>
+            <wp:docPr id="1436413507" name="Picture 12"/>
+            <wp:cNvGraphicFramePr>
+              <a:graphicFrameLocks xmlns:a="http://schemas.openxmlformats.org/drawingml/2006/main" noChangeAspect="1"/>
+            </wp:cNvGraphicFramePr>
+            <a:graphic xmlns:a="http://schemas.openxmlformats.org/drawingml/2006/main">
+              <a:graphicData uri="http://schemas.openxmlformats.org/drawingml/2006/picture">
+                <pic:pic xmlns:pic="http://schemas.openxmlformats.org/drawingml/2006/picture">
+                  <pic:nvPicPr>
+                    <pic:cNvPr id="0" name="Picture 12"/>
+                    <pic:cNvPicPr>
+                      <a:picLocks noChangeAspect="1" noChangeArrowheads="1"/>
+                    </pic:cNvPicPr>
+                  </pic:nvPicPr>
+                  <pic:blipFill>
+                    <a:blip r:embed="rId12">
+                      <a:extLst>
+                        <a:ext uri="{28A0092B-C50C-407E-A947-70E740481C1C}">
+                          <a14:useLocalDpi xmlns:a14="http://schemas.microsoft.com/office/drawing/2010/main" val="0"/>
+                        </a:ext>
+                      </a:extLst>
+                    </a:blip>
+                    <a:srcRect/>
+                    <a:stretch>
+                      <a:fillRect/>
+                    </a:stretch>
+                  </pic:blipFill>
+                  <pic:spPr bwMode="auto">
+                    <a:xfrm>
+                      <a:off x="0" y="0"/>
+                      <a:ext cx="5941695" cy="6300470"/>
+                    </a:xfrm>
+                    <a:prstGeom prst="rect">
+                      <a:avLst/>
+                    </a:prstGeom>
+                    <a:noFill/>
+                    <a:ln>
+                      <a:noFill/>
+                    </a:ln>
+                  </pic:spPr>
+                </pic:pic>
+              </a:graphicData>
+            </a:graphic>
+          </wp:inline>
+        </w:drawing>
+      </w:r>
+    </w:p>
+    <w:p>
+      <w:r>
+        <w:t>From staging area to local git repository (.git folder)</w:t>
+      </w:r>
+    </w:p>
+    <w:p>
+      <w:r>
+        <w:t xml:space="preserve">git commit </w:t>
+      </w:r>
+      <w:r>
+        <w:t xml:space="preserve">-m </w:t>
+      </w:r>
+    </w:p>
+    <w:p>
+      <w:r>
+        <w:rPr>
+          <w:noProof/>
+        </w:rPr>
+        <w:drawing>
+          <wp:inline distT="0" distB="0" distL="0" distR="0" wp14:anchorId="1BDDCC54" wp14:editId="7BBA8233">
+            <wp:extent cx="5937250" cy="5014595"/>
+            <wp:effectExtent l="0" t="0" r="6350" b="0"/>
+            <wp:docPr id="1055283698" name="Picture 13"/>
+            <wp:cNvGraphicFramePr>
+              <a:graphicFrameLocks xmlns:a="http://schemas.openxmlformats.org/drawingml/2006/main" noChangeAspect="1"/>
+            </wp:cNvGraphicFramePr>
+            <a:graphic xmlns:a="http://schemas.openxmlformats.org/drawingml/2006/main">
+              <a:graphicData uri="http://schemas.openxmlformats.org/drawingml/2006/picture">
+                <pic:pic xmlns:pic="http://schemas.openxmlformats.org/drawingml/2006/picture">
+                  <pic:nvPicPr>
+                    <pic:cNvPr id="0" name="Picture 13"/>
+                    <pic:cNvPicPr>
+                      <a:picLocks noChangeAspect="1" noChangeArrowheads="1"/>
+                    </pic:cNvPicPr>
+                  </pic:nvPicPr>
+                  <pic:blipFill>
+                    <a:blip r:embed="rId13">
+                      <a:extLst>
+                        <a:ext uri="{28A0092B-C50C-407E-A947-70E740481C1C}">
+                          <a14:useLocalDpi xmlns:a14="http://schemas.microsoft.com/office/drawing/2010/main" val="0"/>
+                        </a:ext>
+                      </a:extLst>
+                    </a:blip>
+                    <a:srcRect/>
+                    <a:stretch>
+                      <a:fillRect/>
+                    </a:stretch>
+                  </pic:blipFill>
+                  <pic:spPr bwMode="auto">
+                    <a:xfrm>
+                      <a:off x="0" y="0"/>
+                      <a:ext cx="5937250" cy="5014595"/>
+                    </a:xfrm>
+                    <a:prstGeom prst="rect">
+                      <a:avLst/>
+                    </a:prstGeom>
+                    <a:noFill/>
+                    <a:ln>
+                      <a:noFill/>
+                    </a:ln>
+                  </pic:spPr>
+                </pic:pic>
+              </a:graphicData>
+            </a:graphic>
+          </wp:inline>
+        </w:drawing>
+      </w:r>
+    </w:p>
+    <w:p>
+      <w:r>
+        <w:rPr>
+          <w:noProof/>
+        </w:rPr>
+        <w:drawing>
+          <wp:inline distT="0" distB="0" distL="0" distR="0" wp14:anchorId="34D10771" wp14:editId="207E2CF7">
+            <wp:extent cx="5937250" cy="5574030"/>
+            <wp:effectExtent l="0" t="0" r="6350" b="7620"/>
+            <wp:docPr id="1657743736" name="Picture 14"/>
+            <wp:cNvGraphicFramePr>
+              <a:graphicFrameLocks xmlns:a="http://schemas.openxmlformats.org/drawingml/2006/main" noChangeAspect="1"/>
+            </wp:cNvGraphicFramePr>
+            <a:graphic xmlns:a="http://schemas.openxmlformats.org/drawingml/2006/main">
+              <a:graphicData uri="http://schemas.openxmlformats.org/drawingml/2006/picture">
+                <pic:pic xmlns:pic="http://schemas.openxmlformats.org/drawingml/2006/picture">
+                  <pic:nvPicPr>
+                    <pic:cNvPr id="0" name="Picture 14"/>
+                    <pic:cNvPicPr>
+                      <a:picLocks noChangeAspect="1" noChangeArrowheads="1"/>
+                    </pic:cNvPicPr>
+                  </pic:nvPicPr>
+                  <pic:blipFill>
+                    <a:blip r:embed="rId14">
+                      <a:extLst>
+                        <a:ext uri="{28A0092B-C50C-407E-A947-70E740481C1C}">
+                          <a14:useLocalDpi xmlns:a14="http://schemas.microsoft.com/office/drawing/2010/main" val="0"/>
+                        </a:ext>
+                      </a:extLst>
+                    </a:blip>
+                    <a:srcRect/>
+                    <a:stretch>
+                      <a:fillRect/>
+                    </a:stretch>
+                  </pic:blipFill>
+                  <pic:spPr bwMode="auto">
+                    <a:xfrm>
+                      <a:off x="0" y="0"/>
+                      <a:ext cx="5937250" cy="5574030"/>
+                    </a:xfrm>
+                    <a:prstGeom prst="rect">
+                      <a:avLst/>
+                    </a:prstGeom>
+                    <a:noFill/>
+                    <a:ln>
+                      <a:noFill/>
+                    </a:ln>
+                  </pic:spPr>
+                </pic:pic>
+              </a:graphicData>
+            </a:graphic>
+          </wp:inline>
+        </w:drawing>
+      </w:r>
+    </w:p>
+    <w:p>
+      <w:r>
+        <w:rPr>
+          <w:noProof/>
+        </w:rPr>
+        <w:drawing>
+          <wp:inline distT="0" distB="0" distL="0" distR="0" wp14:anchorId="5210403D" wp14:editId="23F89A80">
+            <wp:extent cx="5937250" cy="3829050"/>
+            <wp:effectExtent l="0" t="0" r="6350" b="0"/>
+            <wp:docPr id="1770885378" name="Picture 15"/>
+            <wp:cNvGraphicFramePr>
+              <a:graphicFrameLocks xmlns:a="http://schemas.openxmlformats.org/drawingml/2006/main" noChangeAspect="1"/>
+            </wp:cNvGraphicFramePr>
+            <a:graphic xmlns:a="http://schemas.openxmlformats.org/drawingml/2006/main">
+              <a:graphicData uri="http://schemas.openxmlformats.org/drawingml/2006/picture">
+                <pic:pic xmlns:pic="http://schemas.openxmlformats.org/drawingml/2006/picture">
+                  <pic:nvPicPr>
+                    <pic:cNvPr id="0" name="Picture 15"/>
+                    <pic:cNvPicPr>
+                      <a:picLocks noChangeAspect="1" noChangeArrowheads="1"/>
+                    </pic:cNvPicPr>
+                  </pic:nvPicPr>
+                  <pic:blipFill>
+                    <a:blip r:embed="rId15">
+                      <a:extLst>
+                        <a:ext uri="{28A0092B-C50C-407E-A947-70E740481C1C}">
+                          <a14:useLocalDpi xmlns:a14="http://schemas.microsoft.com/office/drawing/2010/main" val="0"/>
+                        </a:ext>
+                      </a:extLst>
+                    </a:blip>
+                    <a:srcRect/>
+                    <a:stretch>
+                      <a:fillRect/>
+                    </a:stretch>
+                  </pic:blipFill>
+                  <pic:spPr bwMode="auto">
+                    <a:xfrm>
+                      <a:off x="0" y="0"/>
+                      <a:ext cx="5937250" cy="3829050"/>
+                    </a:xfrm>
+                    <a:prstGeom prst="rect">
+                      <a:avLst/>
+                    </a:prstGeom>
+                    <a:noFill/>
+                    <a:ln>
+                      <a:noFill/>
+                    </a:ln>
+                  </pic:spPr>
+                </pic:pic>
+              </a:graphicData>
+            </a:graphic>
+          </wp:inline>
+        </w:drawing>
+      </w:r>
+    </w:p>
+    <w:p/>
+    <w:p>
+      <w:r>
+        <w:t xml:space="preserve">After establishing connection, we need to push the code from local git repository to git hub repository </w:t>
+      </w:r>
+      <w:r>
+        <w:t>(repository is a collection of branches)</w:t>
+      </w:r>
+    </w:p>
+    <w:p>
+      <w:r>
+        <w:t xml:space="preserve"> </w:t>
+      </w:r>
+      <w:r>
+        <w:rPr>
+          <w:noProof/>
+        </w:rPr>
+        <w:drawing>
+          <wp:inline distT="0" distB="0" distL="0" distR="0" wp14:anchorId="26D1C762" wp14:editId="0784DE61">
+            <wp:extent cx="5933440" cy="2814320"/>
+            <wp:effectExtent l="0" t="0" r="0" b="5080"/>
+            <wp:docPr id="25280587" name="Picture 16"/>
+            <wp:cNvGraphicFramePr>
+              <a:graphicFrameLocks xmlns:a="http://schemas.openxmlformats.org/drawingml/2006/main" noChangeAspect="1"/>
+            </wp:cNvGraphicFramePr>
+            <a:graphic xmlns:a="http://schemas.openxmlformats.org/drawingml/2006/main">
+              <a:graphicData uri="http://schemas.openxmlformats.org/drawingml/2006/picture">
+                <pic:pic xmlns:pic="http://schemas.openxmlformats.org/drawingml/2006/picture">
+                  <pic:nvPicPr>
+                    <pic:cNvPr id="0" name="Picture 16"/>
+                    <pic:cNvPicPr>
+                      <a:picLocks noChangeAspect="1" noChangeArrowheads="1"/>
+                    </pic:cNvPicPr>
+                  </pic:nvPicPr>
+                  <pic:blipFill>
+                    <a:blip r:embed="rId16">
+                      <a:extLst>
+                        <a:ext uri="{28A0092B-C50C-407E-A947-70E740481C1C}">
+                          <a14:useLocalDpi xmlns:a14="http://schemas.microsoft.com/office/drawing/2010/main" val="0"/>
+                        </a:ext>
+                      </a:extLst>
+                    </a:blip>
+                    <a:srcRect/>
+                    <a:stretch>
+                      <a:fillRect/>
+                    </a:stretch>
+                  </pic:blipFill>
+                  <pic:spPr bwMode="auto">
+                    <a:xfrm>
+                      <a:off x="0" y="0"/>
+                      <a:ext cx="5933440" cy="2814320"/>
+                    </a:xfrm>
+                    <a:prstGeom prst="rect">
+                      <a:avLst/>
+                    </a:prstGeom>
+                    <a:noFill/>
+                    <a:ln>
+                      <a:noFill/>
+                    </a:ln>
+                  </pic:spPr>
+                </pic:pic>
+              </a:graphicData>
+            </a:graphic>
+          </wp:inline>
+        </w:drawing>
+      </w:r>
+      <w:r>
+        <w:t xml:space="preserve">  </w:t>
+      </w:r>
+    </w:p>
+    <w:p/>
+    <w:p>
+      <w:r>
+        <w:rPr>
+          <w:noProof/>
+        </w:rPr>
+        <w:drawing>
+          <wp:inline distT="0" distB="0" distL="0" distR="0" wp14:anchorId="718EE25C" wp14:editId="6C9BB336">
+            <wp:extent cx="5937250" cy="5590540"/>
+            <wp:effectExtent l="0" t="0" r="6350" b="0"/>
+            <wp:docPr id="1109917456" name="Picture 17"/>
+            <wp:cNvGraphicFramePr>
+              <a:graphicFrameLocks xmlns:a="http://schemas.openxmlformats.org/drawingml/2006/main" noChangeAspect="1"/>
+            </wp:cNvGraphicFramePr>
+            <a:graphic xmlns:a="http://schemas.openxmlformats.org/drawingml/2006/main">
+              <a:graphicData uri="http://schemas.openxmlformats.org/drawingml/2006/picture">
+                <pic:pic xmlns:pic="http://schemas.openxmlformats.org/drawingml/2006/picture">
+                  <pic:nvPicPr>
+                    <pic:cNvPr id="0" name="Picture 17"/>
+                    <pic:cNvPicPr>
+                      <a:picLocks noChangeAspect="1" noChangeArrowheads="1"/>
+                    </pic:cNvPicPr>
+                  </pic:nvPicPr>
+                  <pic:blipFill>
+                    <a:blip r:embed="rId17">
+                      <a:extLst>
+                        <a:ext uri="{28A0092B-C50C-407E-A947-70E740481C1C}">
+                          <a14:useLocalDpi xmlns:a14="http://schemas.microsoft.com/office/drawing/2010/main" val="0"/>
+                        </a:ext>
+                      </a:extLst>
+                    </a:blip>
+                    <a:srcRect/>
+                    <a:stretch>
+                      <a:fillRect/>
+                    </a:stretch>
+                  </pic:blipFill>
+                  <pic:spPr bwMode="auto">
+                    <a:xfrm>
+                      <a:off x="0" y="0"/>
+                      <a:ext cx="5937250" cy="5590540"/>
+                    </a:xfrm>
+                    <a:prstGeom prst="rect">
+                      <a:avLst/>
+                    </a:prstGeom>
+                    <a:noFill/>
+                    <a:ln>
+                      <a:noFill/>
+                    </a:ln>
+                  </pic:spPr>
+                </pic:pic>
+              </a:graphicData>
+            </a:graphic>
+          </wp:inline>
+        </w:drawing>
+      </w:r>
+    </w:p>
+    <w:p/>
+    <w:p/>
+    <w:p>
+      <w:pPr>
+        <w:rPr>
+          <w:b/>
+          <w:bCs/>
+        </w:rPr>
+      </w:pPr>
+      <w:r>
+        <w:rPr>
+          <w:b/>
+          <w:bCs/>
+        </w:rPr>
+        <w:t xml:space="preserve">After pushing the code to Github, </w:t>
+      </w:r>
+      <w:r>
+        <w:rPr>
+          <w:b/>
+          <w:bCs/>
+        </w:rPr>
+        <w:t>if you make any changes to the code after pushing to Github. U can see the modified with letter M (see below)</w:t>
+      </w:r>
+    </w:p>
+    <w:p>
+      <w:pPr>
+        <w:rPr>
+          <w:b/>
+          <w:bCs/>
+        </w:rPr>
+      </w:pPr>
+    </w:p>
+    <w:p>
+      <w:pPr>
+        <w:rPr>
+          <w:b/>
+          <w:bCs/>
+        </w:rPr>
+      </w:pPr>
+      <w:r>
+        <w:rPr>
+          <w:b/>
+          <w:bCs/>
+          <w:noProof/>
+        </w:rPr>
+        <w:drawing>
+          <wp:inline distT="0" distB="0" distL="0" distR="0" wp14:anchorId="4565C3A9" wp14:editId="647CDA81">
+            <wp:extent cx="5934075" cy="3048000"/>
+            <wp:effectExtent l="0" t="0" r="9525" b="0"/>
+            <wp:docPr id="809502521" name="Picture 1"/>
+            <wp:cNvGraphicFramePr>
+              <a:graphicFrameLocks xmlns:a="http://schemas.openxmlformats.org/drawingml/2006/main" noChangeAspect="1"/>
+            </wp:cNvGraphicFramePr>
+            <a:graphic xmlns:a="http://schemas.openxmlformats.org/drawingml/2006/main">
+              <a:graphicData uri="http://schemas.openxmlformats.org/drawingml/2006/picture">
+                <pic:pic xmlns:pic="http://schemas.openxmlformats.org/drawingml/2006/picture">
+                  <pic:nvPicPr>
+                    <pic:cNvPr id="0" name="Picture 1"/>
+                    <pic:cNvPicPr>
+                      <a:picLocks noChangeAspect="1" noChangeArrowheads="1"/>
+                    </pic:cNvPicPr>
+                  </pic:nvPicPr>
+                  <pic:blipFill>
+                    <a:blip r:embed="rId18">
+                      <a:extLst>
+                        <a:ext uri="{28A0092B-C50C-407E-A947-70E740481C1C}">
+                          <a14:useLocalDpi xmlns:a14="http://schemas.microsoft.com/office/drawing/2010/main" val="0"/>
+                        </a:ext>
+                      </a:extLst>
+                    </a:blip>
+                    <a:srcRect/>
+                    <a:stretch>
+                      <a:fillRect/>
+                    </a:stretch>
+                  </pic:blipFill>
+                  <pic:spPr bwMode="auto">
+                    <a:xfrm>
+                      <a:off x="0" y="0"/>
+                      <a:ext cx="5934075" cy="3048000"/>
+                    </a:xfrm>
+                    <a:prstGeom prst="rect">
+                      <a:avLst/>
+                    </a:prstGeom>
+                    <a:noFill/>
+                    <a:ln>
+                      <a:noFill/>
+                    </a:ln>
+                  </pic:spPr>
+                </pic:pic>
+              </a:graphicData>
+            </a:graphic>
+          </wp:inline>
+        </w:drawing>
+      </w:r>
+    </w:p>
+    <w:p>
+      <w:pPr>
+        <w:rPr>
+          <w:b/>
+          <w:bCs/>
+        </w:rPr>
+      </w:pPr>
+    </w:p>
+    <w:p>
+      <w:pPr>
+        <w:rPr>
+          <w:b/>
+          <w:bCs/>
+        </w:rPr>
+      </w:pPr>
+      <w:r>
+        <w:rPr>
+          <w:b/>
+          <w:bCs/>
+        </w:rPr>
+        <w:t>Use the + sign next to each .js file to save the file first</w:t>
+      </w:r>
+    </w:p>
+    <w:p>
+      <w:pPr>
+        <w:rPr>
+          <w:b/>
+          <w:bCs/>
+        </w:rPr>
+      </w:pPr>
+    </w:p>
+    <w:p>
+      <w:pPr>
+        <w:rPr>
+          <w:b/>
+          <w:bCs/>
+        </w:rPr>
+      </w:pPr>
+      <w:r>
+        <w:rPr>
+          <w:b/>
+          <w:bCs/>
+        </w:rPr>
+        <w:drawing>
+          <wp:inline distT="0" distB="0" distL="0" distR="0" wp14:anchorId="465EA102" wp14:editId="6152BA28">
+            <wp:extent cx="5943600" cy="3041015"/>
+            <wp:effectExtent l="0" t="0" r="0" b="6985"/>
+            <wp:docPr id="1601286584" name="Picture 1"/>
+            <wp:cNvGraphicFramePr>
+              <a:graphicFrameLocks xmlns:a="http://schemas.openxmlformats.org/drawingml/2006/main" noChangeAspect="1"/>
+            </wp:cNvGraphicFramePr>
+            <a:graphic xmlns:a="http://schemas.openxmlformats.org/drawingml/2006/main">
+              <a:graphicData uri="http://schemas.openxmlformats.org/drawingml/2006/picture">
+                <pic:pic xmlns:pic="http://schemas.openxmlformats.org/drawingml/2006/picture">
+                  <pic:nvPicPr>
+                    <pic:cNvPr id="1601286584" name=""/>
+                    <pic:cNvPicPr/>
+                  </pic:nvPicPr>
+                  <pic:blipFill>
+                    <a:blip r:embed="rId19"/>
+                    <a:stretch>
+                      <a:fillRect/>
+                    </a:stretch>
+                  </pic:blipFill>
+                  <pic:spPr>
+                    <a:xfrm>
+                      <a:off x="0" y="0"/>
+                      <a:ext cx="5943600" cy="3041015"/>
+                    </a:xfrm>
+                    <a:prstGeom prst="rect">
+                      <a:avLst/>
+                    </a:prstGeom>
+                  </pic:spPr>
+                </pic:pic>
+              </a:graphicData>
+            </a:graphic>
+          </wp:inline>
+        </w:drawing>
+      </w:r>
+    </w:p>
+    <w:p>
+      <w:pPr>
+        <w:rPr>
+          <w:b/>
+          <w:bCs/>
+        </w:rPr>
+      </w:pPr>
+    </w:p>
+    <w:p>
+      <w:pPr>
+        <w:rPr>
+          <w:b/>
+          <w:bCs/>
+        </w:rPr>
+      </w:pPr>
+      <w:r>
+        <w:rPr>
+          <w:b/>
+          <w:bCs/>
+        </w:rPr>
+        <w:t xml:space="preserve">We can see above that saved changes 3 and changes needed to be done 0 </w:t>
+      </w:r>
+    </w:p>
+    <w:p>
+      <w:pPr>
+        <w:rPr>
+          <w:b/>
+          <w:bCs/>
+        </w:rPr>
+      </w:pPr>
+    </w:p>
+    <w:p>
+      <w:pPr>
+        <w:rPr>
+          <w:b/>
+          <w:bCs/>
+        </w:rPr>
+      </w:pPr>
+      <w:r>
+        <w:rPr>
+          <w:b/>
+          <w:bCs/>
+        </w:rPr>
+        <w:t xml:space="preserve">These three saved files are ready to commit now </w:t>
+      </w:r>
+    </w:p>
+    <w:p>
+      <w:pPr>
+        <w:rPr>
+          <w:b/>
+          <w:bCs/>
+        </w:rPr>
+      </w:pPr>
+      <w:r>
+        <w:rPr>
+          <w:b/>
+          <w:bCs/>
+          <w:noProof/>
+        </w:rPr>
+        <w:drawing>
+          <wp:inline distT="0" distB="0" distL="0" distR="0" wp14:anchorId="13BC8B8D" wp14:editId="264CCB26">
+            <wp:extent cx="5153025" cy="4581525"/>
+            <wp:effectExtent l="0" t="0" r="9525" b="9525"/>
+            <wp:docPr id="1468922007" name="Picture 2"/>
+            <wp:cNvGraphicFramePr>
+              <a:graphicFrameLocks xmlns:a="http://schemas.openxmlformats.org/drawingml/2006/main" noChangeAspect="1"/>
+            </wp:cNvGraphicFramePr>
+            <a:graphic xmlns:a="http://schemas.openxmlformats.org/drawingml/2006/main">
+              <a:graphicData uri="http://schemas.openxmlformats.org/drawingml/2006/picture">
+                <pic:pic xmlns:pic="http://schemas.openxmlformats.org/drawingml/2006/picture">
+                  <pic:nvPicPr>
+                    <pic:cNvPr id="0" name="Picture 2"/>
+                    <pic:cNvPicPr>
+                      <a:picLocks noChangeAspect="1" noChangeArrowheads="1"/>
+                    </pic:cNvPicPr>
+                  </pic:nvPicPr>
+                  <pic:blipFill>
+                    <a:blip r:embed="rId20">
+                      <a:extLst>
+                        <a:ext uri="{28A0092B-C50C-407E-A947-70E740481C1C}">
+                          <a14:useLocalDpi xmlns:a14="http://schemas.microsoft.com/office/drawing/2010/main" val="0"/>
+                        </a:ext>
+                      </a:extLst>
+                    </a:blip>
+                    <a:srcRect/>
+                    <a:stretch>
+                      <a:fillRect/>
+                    </a:stretch>
+                  </pic:blipFill>
+                  <pic:spPr bwMode="auto">
+                    <a:xfrm>
+                      <a:off x="0" y="0"/>
+                      <a:ext cx="5153025" cy="4581525"/>
+                    </a:xfrm>
+                    <a:prstGeom prst="rect">
+                      <a:avLst/>
+                    </a:prstGeom>
+                    <a:noFill/>
+                    <a:ln>
+                      <a:noFill/>
+                    </a:ln>
+                  </pic:spPr>
+                </pic:pic>
+              </a:graphicData>
+            </a:graphic>
+          </wp:inline>
+        </w:drawing>
+      </w:r>
+    </w:p>
+    <w:p>
+      <w:pPr>
+        <w:rPr>
+          <w:b/>
+          <w:bCs/>
+        </w:rPr>
+      </w:pPr>
+    </w:p>
+    <w:p>
+      <w:pPr>
+        <w:rPr>
+          <w:b/>
+          <w:bCs/>
+        </w:rPr>
+      </w:pPr>
+      <w:r>
+        <w:rPr>
+          <w:b/>
+          <w:bCs/>
+          <w:noProof/>
+        </w:rPr>
+        <w:drawing>
+          <wp:inline distT="0" distB="0" distL="0" distR="0" wp14:anchorId="262CBE2E" wp14:editId="6B6291DF">
+            <wp:extent cx="5934075" cy="3057525"/>
+            <wp:effectExtent l="0" t="0" r="9525" b="9525"/>
+            <wp:docPr id="1094349999" name="Picture 3"/>
+            <wp:cNvGraphicFramePr>
+              <a:graphicFrameLocks xmlns:a="http://schemas.openxmlformats.org/drawingml/2006/main" noChangeAspect="1"/>
+            </wp:cNvGraphicFramePr>
+            <a:graphic xmlns:a="http://schemas.openxmlformats.org/drawingml/2006/main">
+              <a:graphicData uri="http://schemas.openxmlformats.org/drawingml/2006/picture">
+                <pic:pic xmlns:pic="http://schemas.openxmlformats.org/drawingml/2006/picture">
+                  <pic:nvPicPr>
+                    <pic:cNvPr id="0" name="Picture 3"/>
+                    <pic:cNvPicPr>
+                      <a:picLocks noChangeAspect="1" noChangeArrowheads="1"/>
+                    </pic:cNvPicPr>
+                  </pic:nvPicPr>
+                  <pic:blipFill>
+                    <a:blip r:embed="rId21">
+                      <a:extLst>
+                        <a:ext uri="{28A0092B-C50C-407E-A947-70E740481C1C}">
+                          <a14:useLocalDpi xmlns:a14="http://schemas.microsoft.com/office/drawing/2010/main" val="0"/>
+                        </a:ext>
+                      </a:extLst>
+                    </a:blip>
+                    <a:srcRect/>
+                    <a:stretch>
+                      <a:fillRect/>
+                    </a:stretch>
+                  </pic:blipFill>
+                  <pic:spPr bwMode="auto">
+                    <a:xfrm>
+                      <a:off x="0" y="0"/>
+                      <a:ext cx="5934075" cy="3057525"/>
+                    </a:xfrm>
+                    <a:prstGeom prst="rect">
+                      <a:avLst/>
+                    </a:prstGeom>
+                    <a:noFill/>
+                    <a:ln>
+                      <a:noFill/>
+                    </a:ln>
+                  </pic:spPr>
+                </pic:pic>
+              </a:graphicData>
+            </a:graphic>
+          </wp:inline>
+        </w:drawing>
+      </w:r>
+    </w:p>
+    <w:p>
+      <w:pPr>
+        <w:rPr>
+          <w:b/>
+          <w:bCs/>
+        </w:rPr>
+      </w:pPr>
+    </w:p>
+    <w:p>
+      <w:pPr>
+        <w:rPr>
+          <w:b/>
+          <w:bCs/>
+        </w:rPr>
+      </w:pPr>
+    </w:p>
+    <w:p>
+      <w:pPr>
+        <w:rPr>
+          <w:b/>
+          <w:bCs/>
+        </w:rPr>
+      </w:pPr>
+    </w:p>
     <w:sectPr>
       <w:pgSz w:w="12240" w:h="15840"/>
       <w:pgMar w:top="1440" w:right="1440" w:bottom="1440" w:left="1440" w:header="720" w:footer="720" w:gutter="0"/>

</xml_diff>